<commit_message>
docs: ampliar almacenamiento para 8000 beneficiarios y dejar solo hosting on-premise
- Volumen de datos recomendado: 800 GB - 1 TB SSD
- Premisas explicitas en la introduccion
- Tabla de hosting reducida a la modalidad on-premise MINTIC

Co-Authored-By: Claude Opus 4.7 (1M context) <noreply@anthropic.com>
</commit_message>
<xml_diff>
--- a/docs/Recursos_Tecnicos_Despliegue_MINTIC.docx
+++ b/docs/Recursos_Tecnicos_Despliegue_MINTIC.docx
@@ -75,7 +75,7 @@
           <w:sz w:val="24"/>
           <w:szCs w:val="24"/>
         </w:rPr>
-        <w:t xml:space="preserve">Versión 1.0</w:t>
+        <w:t xml:space="preserve">Versión 1.1</w:t>
       </w:r>
     </w:p>
     <w:p>
@@ -254,7 +254,136 @@
           <w:sz w:val="22"/>
           <w:szCs w:val="22"/>
         </w:rPr>
-        <w:t xml:space="preserve">El informe contempla el despliegue de una única instancia productiva del aplicativo, con base de datos embebida (SQLite) y almacenamiento local de archivos. Se incluyen recomendaciones sobre escalabilidad y alta disponibilidad como referencia, sin que constituyan parte del despliegue mínimo viable.</w:t>
+        <w:t xml:space="preserve">El informe contempla el despliegue de una única instancia productiva del aplicativo, con base de datos embebida (SQLite) y almacenamiento local de archivos. El dimensionamiento de los recursos se realiza considerando una base estimada de 8.000 beneficiarios, cada uno con la posibilidad de cargar hasta 5 archivos de hasta 10 MB. Se incluyen recomendaciones sobre escalabilidad y alta disponibilidad como referencia, sin que constituyan parte del despliegue mínimo viable.</w:t>
+      </w:r>
+    </w:p>
+    <w:p>
+      <w:pPr>
+        <w:pStyle w:val="Heading2"/>
+        <w:spacing w:after="120" w:before="240"/>
+      </w:pPr>
+      <w:r>
+        <w:rPr>
+          <w:rFonts w:ascii="Arial" w:cs="Arial" w:eastAsia="Arial" w:hAnsi="Arial"/>
+          <w:b/>
+          <w:bCs/>
+          <w:color w:val="1F4E79"/>
+          <w:sz w:val="26"/>
+          <w:szCs w:val="26"/>
+        </w:rPr>
+        <w:t xml:space="preserve">1.3 Premisas de dimensionamiento</w:t>
+      </w:r>
+    </w:p>
+    <w:p>
+      <w:pPr>
+        <w:pStyle w:val="ListParagraph"/>
+        <w:numPr>
+          <w:ilvl w:val="0"/>
+          <w:numId w:val="2"/>
+        </w:numPr>
+        <w:spacing w:after="40" w:before="40" w:line="280"/>
+      </w:pPr>
+      <w:r>
+        <w:rPr>
+          <w:rFonts w:ascii="Arial" w:cs="Arial" w:eastAsia="Arial" w:hAnsi="Arial"/>
+          <w:b/>
+          <w:bCs/>
+          <w:sz w:val="22"/>
+          <w:szCs w:val="22"/>
+        </w:rPr>
+        <w:t xml:space="preserve">Población objetivo: </w:t>
+      </w:r>
+      <w:r>
+        <w:rPr>
+          <w:rFonts w:ascii="Arial" w:cs="Arial" w:eastAsia="Arial" w:hAnsi="Arial"/>
+          <w:sz w:val="22"/>
+          <w:szCs w:val="22"/>
+        </w:rPr>
+        <w:t xml:space="preserve">aproximadamente 8.000 beneficiarios registrados.</w:t>
+      </w:r>
+    </w:p>
+    <w:p>
+      <w:pPr>
+        <w:pStyle w:val="ListParagraph"/>
+        <w:numPr>
+          <w:ilvl w:val="0"/>
+          <w:numId w:val="2"/>
+        </w:numPr>
+        <w:spacing w:after="40" w:before="40" w:line="280"/>
+      </w:pPr>
+      <w:r>
+        <w:rPr>
+          <w:rFonts w:ascii="Arial" w:cs="Arial" w:eastAsia="Arial" w:hAnsi="Arial"/>
+          <w:b/>
+          <w:bCs/>
+          <w:sz w:val="22"/>
+          <w:szCs w:val="22"/>
+        </w:rPr>
+        <w:t xml:space="preserve">Carga de archivos: </w:t>
+      </w:r>
+      <w:r>
+        <w:rPr>
+          <w:rFonts w:ascii="Arial" w:cs="Arial" w:eastAsia="Arial" w:hAnsi="Arial"/>
+          <w:sz w:val="22"/>
+          <w:szCs w:val="22"/>
+        </w:rPr>
+        <w:t xml:space="preserve">hasta 5 archivos por envío, con un tamaño máximo de 10 MB cada uno (50 MB por beneficiario en el peor caso).</w:t>
+      </w:r>
+    </w:p>
+    <w:p>
+      <w:pPr>
+        <w:pStyle w:val="ListParagraph"/>
+        <w:numPr>
+          <w:ilvl w:val="0"/>
+          <w:numId w:val="2"/>
+        </w:numPr>
+        <w:spacing w:after="40" w:before="40" w:line="280"/>
+      </w:pPr>
+      <w:r>
+        <w:rPr>
+          <w:rFonts w:ascii="Arial" w:cs="Arial" w:eastAsia="Arial" w:hAnsi="Arial"/>
+          <w:b/>
+          <w:bCs/>
+          <w:sz w:val="22"/>
+          <w:szCs w:val="22"/>
+        </w:rPr>
+        <w:t xml:space="preserve">Concurrencia estimada: </w:t>
+      </w:r>
+      <w:r>
+        <w:rPr>
+          <w:rFonts w:ascii="Arial" w:cs="Arial" w:eastAsia="Arial" w:hAnsi="Arial"/>
+          <w:sz w:val="22"/>
+          <w:szCs w:val="22"/>
+        </w:rPr>
+        <w:t xml:space="preserve">hasta 200 usuarios simultáneos en horas pico.</w:t>
+      </w:r>
+    </w:p>
+    <w:p>
+      <w:pPr>
+        <w:pStyle w:val="ListParagraph"/>
+        <w:numPr>
+          <w:ilvl w:val="0"/>
+          <w:numId w:val="2"/>
+        </w:numPr>
+        <w:spacing w:after="40" w:before="40" w:line="280"/>
+      </w:pPr>
+      <w:r>
+        <w:rPr>
+          <w:rFonts w:ascii="Arial" w:cs="Arial" w:eastAsia="Arial" w:hAnsi="Arial"/>
+          <w:b/>
+          <w:bCs/>
+          <w:sz w:val="22"/>
+          <w:szCs w:val="22"/>
+        </w:rPr>
+        <w:t xml:space="preserve">Horizonte de planeación: </w:t>
+      </w:r>
+      <w:r>
+        <w:rPr>
+          <w:rFonts w:ascii="Arial" w:cs="Arial" w:eastAsia="Arial" w:hAnsi="Arial"/>
+          <w:sz w:val="22"/>
+          <w:szCs w:val="22"/>
+        </w:rPr>
+        <w:t xml:space="preserve">12 a 24 meses, con margen de crecimiento del 25 %.</w:t>
       </w:r>
     </w:p>
     <w:p>
@@ -1126,7 +1255,7 @@
           <w:sz w:val="22"/>
           <w:szCs w:val="22"/>
         </w:rPr>
-        <w:t xml:space="preserve">El aplicativo puede ejecutarse sobre una única máquina virtual o servidor dedicado. El dimensionamiento se ha calculado considerando una carga estimada de hasta 200 usuarios concurrentes, con picos de generación de documentos.</w:t>
+        <w:t xml:space="preserve">El aplicativo puede ejecutarse sobre una única máquina virtual o servidor dedicado. El dimensionamiento se ha calculado considerando una base de 8.000 beneficiarios, con hasta 200 usuarios concurrentes y picos de generación de documentos.</w:t>
       </w:r>
     </w:p>
     <w:p>
@@ -1439,7 +1568,7 @@
                 <w:sz w:val="20"/>
                 <w:szCs w:val="20"/>
               </w:rPr>
-              <w:t xml:space="preserve">2 GB</w:t>
+              <w:t xml:space="preserve">4 GB</w:t>
             </w:r>
           </w:p>
         </w:tc>
@@ -1473,7 +1602,7 @@
                 <w:sz w:val="20"/>
                 <w:szCs w:val="20"/>
               </w:rPr>
-              <w:t xml:space="preserve">4 a 8 GB</w:t>
+              <w:t xml:space="preserve">8 GB</w:t>
             </w:r>
           </w:p>
         </w:tc>
@@ -1508,7 +1637,7 @@
                 <w:sz w:val="20"/>
                 <w:szCs w:val="20"/>
               </w:rPr>
-              <w:t xml:space="preserve">Almacenamiento</w:t>
+              <w:t xml:space="preserve">Almacenamiento (sistema)</w:t>
             </w:r>
           </w:p>
         </w:tc>
@@ -1541,7 +1670,7 @@
                 <w:sz w:val="20"/>
                 <w:szCs w:val="20"/>
               </w:rPr>
-              <w:t xml:space="preserve">20 GB SSD</w:t>
+              <w:t xml:space="preserve">50 GB SSD</w:t>
             </w:r>
           </w:p>
         </w:tc>
@@ -1574,7 +1703,7 @@
                 <w:sz w:val="20"/>
                 <w:szCs w:val="20"/>
               </w:rPr>
-              <w:t xml:space="preserve">50 a 100 GB SSD</w:t>
+              <w:t xml:space="preserve">100 GB SSD</w:t>
             </w:r>
           </w:p>
         </w:tc>
@@ -1610,7 +1739,7 @@
                 <w:sz w:val="20"/>
                 <w:szCs w:val="20"/>
               </w:rPr>
-              <w:t xml:space="preserve">Ancho de banda</w:t>
+              <w:t xml:space="preserve">Almacenamiento (datos y archivos)</w:t>
             </w:r>
           </w:p>
         </w:tc>
@@ -1644,7 +1773,7 @@
                 <w:sz w:val="20"/>
                 <w:szCs w:val="20"/>
               </w:rPr>
-              <w:t xml:space="preserve">100 Mbps</w:t>
+              <w:t xml:space="preserve">500 GB SSD</w:t>
             </w:r>
           </w:p>
         </w:tc>
@@ -1678,7 +1807,7 @@
                 <w:sz w:val="20"/>
                 <w:szCs w:val="20"/>
               </w:rPr>
-              <w:t xml:space="preserve">1 Gbps simétrico</w:t>
+              <w:t xml:space="preserve">1 TB SSD</w:t>
             </w:r>
           </w:p>
         </w:tc>
@@ -1713,6 +1842,108 @@
                 <w:sz w:val="20"/>
                 <w:szCs w:val="20"/>
               </w:rPr>
+              <w:t xml:space="preserve">Ancho de banda</w:t>
+            </w:r>
+          </w:p>
+        </w:tc>
+        <w:tc>
+          <w:tcPr>
+            <w:tcW w:type="dxa" w:w="3500"/>
+            <w:tcBorders>
+              <w:top w:val="single" w:color="CCCCCC" w:sz="4"/>
+              <w:left w:val="single" w:color="CCCCCC" w:sz="4"/>
+              <w:bottom w:val="single" w:color="CCCCCC" w:sz="4"/>
+              <w:right w:val="single" w:color="CCCCCC" w:sz="4"/>
+            </w:tcBorders>
+            <w:tcMar>
+              <w:top w:type="dxa" w:w="80"/>
+              <w:left w:type="dxa" w:w="140"/>
+              <w:bottom w:type="dxa" w:w="80"/>
+              <w:right w:type="dxa" w:w="140"/>
+            </w:tcMar>
+          </w:tcPr>
+          <w:p>
+            <w:pPr>
+              <w:spacing w:after="40" w:before="40"/>
+              <w:jc w:val="left"/>
+            </w:pPr>
+            <w:r>
+              <w:rPr>
+                <w:rFonts w:ascii="Arial" w:cs="Arial" w:eastAsia="Arial" w:hAnsi="Arial"/>
+                <w:b w:val="false"/>
+                <w:bCs w:val="false"/>
+                <w:sz w:val="20"/>
+                <w:szCs w:val="20"/>
+              </w:rPr>
+              <w:t xml:space="preserve">100 Mbps</w:t>
+            </w:r>
+          </w:p>
+        </w:tc>
+        <w:tc>
+          <w:tcPr>
+            <w:tcW w:type="dxa" w:w="3660"/>
+            <w:tcBorders>
+              <w:top w:val="single" w:color="CCCCCC" w:sz="4"/>
+              <w:left w:val="single" w:color="CCCCCC" w:sz="4"/>
+              <w:bottom w:val="single" w:color="CCCCCC" w:sz="4"/>
+              <w:right w:val="single" w:color="CCCCCC" w:sz="4"/>
+            </w:tcBorders>
+            <w:tcMar>
+              <w:top w:type="dxa" w:w="80"/>
+              <w:left w:type="dxa" w:w="140"/>
+              <w:bottom w:type="dxa" w:w="80"/>
+              <w:right w:type="dxa" w:w="140"/>
+            </w:tcMar>
+          </w:tcPr>
+          <w:p>
+            <w:pPr>
+              <w:spacing w:after="40" w:before="40"/>
+              <w:jc w:val="left"/>
+            </w:pPr>
+            <w:r>
+              <w:rPr>
+                <w:rFonts w:ascii="Arial" w:cs="Arial" w:eastAsia="Arial" w:hAnsi="Arial"/>
+                <w:b w:val="false"/>
+                <w:bCs w:val="false"/>
+                <w:sz w:val="20"/>
+                <w:szCs w:val="20"/>
+              </w:rPr>
+              <w:t xml:space="preserve">1 Gbps simétrico</w:t>
+            </w:r>
+          </w:p>
+        </w:tc>
+      </w:tr>
+      <w:tr>
+        <w:tc>
+          <w:tcPr>
+            <w:tcW w:type="dxa" w:w="2200"/>
+            <w:tcBorders>
+              <w:top w:val="single" w:color="CCCCCC" w:sz="4"/>
+              <w:left w:val="single" w:color="CCCCCC" w:sz="4"/>
+              <w:bottom w:val="single" w:color="CCCCCC" w:sz="4"/>
+              <w:right w:val="single" w:color="CCCCCC" w:sz="4"/>
+            </w:tcBorders>
+            <w:shd w:fill="F2F7FB" w:val="clear"/>
+            <w:tcMar>
+              <w:top w:type="dxa" w:w="80"/>
+              <w:left w:type="dxa" w:w="140"/>
+              <w:bottom w:type="dxa" w:w="80"/>
+              <w:right w:type="dxa" w:w="140"/>
+            </w:tcMar>
+          </w:tcPr>
+          <w:p>
+            <w:pPr>
+              <w:spacing w:after="40" w:before="40"/>
+              <w:jc w:val="left"/>
+            </w:pPr>
+            <w:r>
+              <w:rPr>
+                <w:rFonts w:ascii="Arial" w:cs="Arial" w:eastAsia="Arial" w:hAnsi="Arial"/>
+                <w:b/>
+                <w:bCs/>
+                <w:sz w:val="20"/>
+                <w:szCs w:val="20"/>
+              </w:rPr>
               <w:t xml:space="preserve">Arquitectura</w:t>
             </w:r>
           </w:p>
@@ -1726,6 +1957,7 @@
               <w:bottom w:val="single" w:color="CCCCCC" w:sz="4"/>
               <w:right w:val="single" w:color="CCCCCC" w:sz="4"/>
             </w:tcBorders>
+            <w:shd w:fill="F2F7FB" w:val="clear"/>
             <w:tcMar>
               <w:top w:type="dxa" w:w="80"/>
               <w:left w:type="dxa" w:w="140"/>
@@ -1759,6 +1991,7 @@
               <w:bottom w:val="single" w:color="CCCCCC" w:sz="4"/>
               <w:right w:val="single" w:color="CCCCCC" w:sz="4"/>
             </w:tcBorders>
+            <w:shd w:fill="F2F7FB" w:val="clear"/>
             <w:tcMar>
               <w:top w:type="dxa" w:w="80"/>
               <w:left w:type="dxa" w:w="140"/>
@@ -1843,7 +2076,25 @@
           <w:sz w:val="22"/>
           <w:szCs w:val="22"/>
         </w:rPr>
-        <w:t xml:space="preserve">El almacenamiento contempla la base de datos SQLite, los archivos cargados por los operadores (hasta 10 MB cada uno) y el espacio para respaldos rotativos.</w:t>
+        <w:t xml:space="preserve">El almacenamiento se dimensiona para una base de 8.000 beneficiarios con un promedio de 30 a 50 MB de archivos adjuntos por beneficiario, más espacio para la base de datos, los logs, los respaldos y un margen de crecimiento del 25 %.</w:t>
+      </w:r>
+    </w:p>
+    <w:p>
+      <w:pPr>
+        <w:pStyle w:val="ListParagraph"/>
+        <w:numPr>
+          <w:ilvl w:val="0"/>
+          <w:numId w:val="2"/>
+        </w:numPr>
+        <w:spacing w:after="40" w:before="40" w:line="280"/>
+      </w:pPr>
+      <w:r>
+        <w:rPr>
+          <w:rFonts w:ascii="Arial" w:cs="Arial" w:eastAsia="Arial" w:hAnsi="Arial"/>
+          <w:sz w:val="22"/>
+          <w:szCs w:val="22"/>
+        </w:rPr>
+        <w:t xml:space="preserve">Se recomienda separar el volumen del sistema operativo del volumen de datos y archivos, para facilitar el escalamiento independiente y la realización de respaldos.</w:t>
       </w:r>
     </w:p>
     <w:p>
@@ -3525,6 +3776,20 @@
     </w:p>
     <w:p>
       <w:pPr>
+        <w:spacing w:after="80" w:before="80" w:line="300"/>
+        <w:jc w:val="both"/>
+      </w:pPr>
+      <w:r>
+        <w:rPr>
+          <w:rFonts w:ascii="Arial" w:cs="Arial" w:eastAsia="Arial" w:hAnsi="Arial"/>
+          <w:sz w:val="22"/>
+          <w:szCs w:val="22"/>
+        </w:rPr>
+        <w:t xml:space="preserve">El dimensionamiento de almacenamiento se realiza para una base de 8.000 beneficiarios. Considerando que cada beneficiario puede cargar hasta 5 archivos de 10 MB (50 MB en el peor caso) y un promedio realista de 30 a 50 MB por beneficiario, el volumen total de archivos puede alcanzar entre 240 GB y 400 GB, sin contar respaldos ni margen de crecimiento.</w:t>
+      </w:r>
+    </w:p>
+    <w:p>
+      <w:pPr>
         <w:pStyle w:val="Heading2"/>
         <w:spacing w:after="120" w:before="240"/>
       </w:pPr>
@@ -3537,7 +3802,7 @@
           <w:sz w:val="26"/>
           <w:szCs w:val="26"/>
         </w:rPr>
-        <w:t xml:space="preserve">6.1 Almacenamiento de datos</w:t>
+        <w:t xml:space="preserve">6.1 Volumen estimado</w:t>
       </w:r>
     </w:p>
     <w:tbl>
@@ -3763,7 +4028,7 @@
                 <w:sz w:val="20"/>
                 <w:szCs w:val="20"/>
               </w:rPr>
-              <w:t xml:space="preserve">50 a 200 MB</w:t>
+              <w:t xml:space="preserve">500 MB a 2 GB (con 8.000 beneficiarios y sus respuestas)</w:t>
             </w:r>
           </w:p>
         </w:tc>
@@ -3867,7 +4132,7 @@
                 <w:sz w:val="20"/>
                 <w:szCs w:val="20"/>
               </w:rPr>
-              <w:t xml:space="preserve">Hasta 50 GB anuales (según volumen de envíos)</w:t>
+              <w:t xml:space="preserve">240 a 400 GB (8.000 × 30 a 50 MB promedio)</w:t>
             </w:r>
           </w:p>
         </w:tc>
@@ -3968,7 +4233,7 @@
                 <w:sz w:val="20"/>
                 <w:szCs w:val="20"/>
               </w:rPr>
-              <w:t xml:space="preserve">1 a 5 GB con rotación mensual</w:t>
+              <w:t xml:space="preserve">5 a 10 GB con rotación mensual</w:t>
             </w:r>
           </w:p>
         </w:tc>
@@ -4072,7 +4337,212 @@
                 <w:sz w:val="20"/>
                 <w:szCs w:val="20"/>
               </w:rPr>
-              <w:t xml:space="preserve">20 a 40 GB con rotación de 30 días</w:t>
+              <w:t xml:space="preserve">300 a 600 GB con rotación de 30 días</w:t>
+            </w:r>
+          </w:p>
+        </w:tc>
+      </w:tr>
+      <w:tr>
+        <w:tc>
+          <w:tcPr>
+            <w:tcW w:type="dxa" w:w="3000"/>
+            <w:tcBorders>
+              <w:top w:val="single" w:color="CCCCCC" w:sz="4"/>
+              <w:left w:val="single" w:color="CCCCCC" w:sz="4"/>
+              <w:bottom w:val="single" w:color="CCCCCC" w:sz="4"/>
+              <w:right w:val="single" w:color="CCCCCC" w:sz="4"/>
+            </w:tcBorders>
+            <w:tcMar>
+              <w:top w:type="dxa" w:w="80"/>
+              <w:left w:type="dxa" w:w="140"/>
+              <w:bottom w:type="dxa" w:w="80"/>
+              <w:right w:type="dxa" w:w="140"/>
+            </w:tcMar>
+          </w:tcPr>
+          <w:p>
+            <w:pPr>
+              <w:spacing w:after="40" w:before="40"/>
+              <w:jc w:val="left"/>
+            </w:pPr>
+            <w:r>
+              <w:rPr>
+                <w:rFonts w:ascii="Arial" w:cs="Arial" w:eastAsia="Arial" w:hAnsi="Arial"/>
+                <w:b/>
+                <w:bCs/>
+                <w:sz w:val="20"/>
+                <w:szCs w:val="20"/>
+              </w:rPr>
+              <w:t xml:space="preserve">Margen de crecimiento</w:t>
+            </w:r>
+          </w:p>
+        </w:tc>
+        <w:tc>
+          <w:tcPr>
+            <w:tcW w:type="dxa" w:w="3000"/>
+            <w:tcBorders>
+              <w:top w:val="single" w:color="CCCCCC" w:sz="4"/>
+              <w:left w:val="single" w:color="CCCCCC" w:sz="4"/>
+              <w:bottom w:val="single" w:color="CCCCCC" w:sz="4"/>
+              <w:right w:val="single" w:color="CCCCCC" w:sz="4"/>
+            </w:tcBorders>
+            <w:tcMar>
+              <w:top w:type="dxa" w:w="80"/>
+              <w:left w:type="dxa" w:w="140"/>
+              <w:bottom w:type="dxa" w:w="80"/>
+              <w:right w:type="dxa" w:w="140"/>
+            </w:tcMar>
+          </w:tcPr>
+          <w:p>
+            <w:pPr>
+              <w:spacing w:after="40" w:before="40"/>
+              <w:jc w:val="left"/>
+            </w:pPr>
+            <w:r>
+              <w:rPr>
+                <w:rFonts w:ascii="Arial" w:cs="Arial" w:eastAsia="Arial" w:hAnsi="Arial"/>
+                <w:b w:val="false"/>
+                <w:bCs w:val="false"/>
+                <w:sz w:val="20"/>
+                <w:szCs w:val="20"/>
+              </w:rPr>
+              <w:t xml:space="preserve">Reservado</w:t>
+            </w:r>
+          </w:p>
+        </w:tc>
+        <w:tc>
+          <w:tcPr>
+            <w:tcW w:type="dxa" w:w="3360"/>
+            <w:tcBorders>
+              <w:top w:val="single" w:color="CCCCCC" w:sz="4"/>
+              <w:left w:val="single" w:color="CCCCCC" w:sz="4"/>
+              <w:bottom w:val="single" w:color="CCCCCC" w:sz="4"/>
+              <w:right w:val="single" w:color="CCCCCC" w:sz="4"/>
+            </w:tcBorders>
+            <w:tcMar>
+              <w:top w:type="dxa" w:w="80"/>
+              <w:left w:type="dxa" w:w="140"/>
+              <w:bottom w:type="dxa" w:w="80"/>
+              <w:right w:type="dxa" w:w="140"/>
+            </w:tcMar>
+          </w:tcPr>
+          <w:p>
+            <w:pPr>
+              <w:spacing w:after="40" w:before="40"/>
+              <w:jc w:val="left"/>
+            </w:pPr>
+            <w:r>
+              <w:rPr>
+                <w:rFonts w:ascii="Arial" w:cs="Arial" w:eastAsia="Arial" w:hAnsi="Arial"/>
+                <w:b w:val="false"/>
+                <w:bCs w:val="false"/>
+                <w:sz w:val="20"/>
+                <w:szCs w:val="20"/>
+              </w:rPr>
+              <w:t xml:space="preserve">25 % adicional sobre el total</w:t>
+            </w:r>
+          </w:p>
+        </w:tc>
+      </w:tr>
+      <w:tr>
+        <w:tc>
+          <w:tcPr>
+            <w:tcW w:type="dxa" w:w="3000"/>
+            <w:tcBorders>
+              <w:top w:val="single" w:color="CCCCCC" w:sz="4"/>
+              <w:left w:val="single" w:color="CCCCCC" w:sz="4"/>
+              <w:bottom w:val="single" w:color="CCCCCC" w:sz="4"/>
+              <w:right w:val="single" w:color="CCCCCC" w:sz="4"/>
+            </w:tcBorders>
+            <w:shd w:fill="F2F7FB" w:val="clear"/>
+            <w:tcMar>
+              <w:top w:type="dxa" w:w="80"/>
+              <w:left w:type="dxa" w:w="140"/>
+              <w:bottom w:type="dxa" w:w="80"/>
+              <w:right w:type="dxa" w:w="140"/>
+            </w:tcMar>
+          </w:tcPr>
+          <w:p>
+            <w:pPr>
+              <w:spacing w:after="40" w:before="40"/>
+              <w:jc w:val="left"/>
+            </w:pPr>
+            <w:r>
+              <w:rPr>
+                <w:rFonts w:ascii="Arial" w:cs="Arial" w:eastAsia="Arial" w:hAnsi="Arial"/>
+                <w:b/>
+                <w:bCs/>
+                <w:sz w:val="20"/>
+                <w:szCs w:val="20"/>
+              </w:rPr>
+              <w:t xml:space="preserve">Total recomendado</w:t>
+            </w:r>
+          </w:p>
+        </w:tc>
+        <w:tc>
+          <w:tcPr>
+            <w:tcW w:type="dxa" w:w="3000"/>
+            <w:tcBorders>
+              <w:top w:val="single" w:color="CCCCCC" w:sz="4"/>
+              <w:left w:val="single" w:color="CCCCCC" w:sz="4"/>
+              <w:bottom w:val="single" w:color="CCCCCC" w:sz="4"/>
+              <w:right w:val="single" w:color="CCCCCC" w:sz="4"/>
+            </w:tcBorders>
+            <w:shd w:fill="F2F7FB" w:val="clear"/>
+            <w:tcMar>
+              <w:top w:type="dxa" w:w="80"/>
+              <w:left w:type="dxa" w:w="140"/>
+              <w:bottom w:type="dxa" w:w="80"/>
+              <w:right w:type="dxa" w:w="140"/>
+            </w:tcMar>
+          </w:tcPr>
+          <w:p>
+            <w:pPr>
+              <w:spacing w:after="40" w:before="40"/>
+              <w:jc w:val="left"/>
+            </w:pPr>
+            <w:r>
+              <w:rPr>
+                <w:rFonts w:ascii="Arial" w:cs="Arial" w:eastAsia="Arial" w:hAnsi="Arial"/>
+                <w:b w:val="false"/>
+                <w:bCs w:val="false"/>
+                <w:sz w:val="20"/>
+                <w:szCs w:val="20"/>
+              </w:rPr>
+              <w:t xml:space="preserve">Volumen de datos</w:t>
+            </w:r>
+          </w:p>
+        </w:tc>
+        <w:tc>
+          <w:tcPr>
+            <w:tcW w:type="dxa" w:w="3360"/>
+            <w:tcBorders>
+              <w:top w:val="single" w:color="CCCCCC" w:sz="4"/>
+              <w:left w:val="single" w:color="CCCCCC" w:sz="4"/>
+              <w:bottom w:val="single" w:color="CCCCCC" w:sz="4"/>
+              <w:right w:val="single" w:color="CCCCCC" w:sz="4"/>
+            </w:tcBorders>
+            <w:shd w:fill="F2F7FB" w:val="clear"/>
+            <w:tcMar>
+              <w:top w:type="dxa" w:w="80"/>
+              <w:left w:type="dxa" w:w="140"/>
+              <w:bottom w:type="dxa" w:w="80"/>
+              <w:right w:type="dxa" w:w="140"/>
+            </w:tcMar>
+          </w:tcPr>
+          <w:p>
+            <w:pPr>
+              <w:spacing w:after="40" w:before="40"/>
+              <w:jc w:val="left"/>
+            </w:pPr>
+            <w:r>
+              <w:rPr>
+                <w:rFonts w:ascii="Arial" w:cs="Arial" w:eastAsia="Arial" w:hAnsi="Arial"/>
+                <w:b w:val="false"/>
+                <w:bCs w:val="false"/>
+                <w:sz w:val="20"/>
+                <w:szCs w:val="20"/>
+              </w:rPr>
+              <w:t xml:space="preserve">800 GB a 1 TB SSD</w:t>
             </w:r>
           </w:p>
         </w:tc>
@@ -4136,7 +4606,7 @@
           <w:sz w:val="22"/>
           <w:szCs w:val="22"/>
         </w:rPr>
-        <w:t xml:space="preserve">Almacenamiento de los respaldos en una ubicación externa al servidor (almacenamiento de objetos institucional, NAS o servicio en la nube).</w:t>
+        <w:t xml:space="preserve">Almacenamiento de los respaldos en una ubicación externa al servidor (almacenamiento de objetos institucional, NAS o servicio en la nube), con una capacidad mínima de 1 TB y crecimiento proyectado a 2 TB.</w:t>
       </w:r>
     </w:p>
     <w:p>
@@ -4172,24 +4642,7 @@
           <w:sz w:val="22"/>
           <w:szCs w:val="22"/>
         </w:rPr>
-        <w:t xml:space="preserve">Pruebas periódicas de restauración para verificar la integridad de los respaldos.</w:t>
-      </w:r>
-    </w:p>
-    <w:p>
-      <w:pPr>
-        <w:pStyle w:val="Heading2"/>
-        <w:spacing w:after="120" w:before="240"/>
-      </w:pPr>
-      <w:r>
-        <w:rPr>
-          <w:rFonts w:ascii="Arial" w:cs="Arial" w:eastAsia="Arial" w:hAnsi="Arial"/>
-          <w:b/>
-          <w:bCs/>
-          <w:color w:val="1F4E79"/>
-          <w:sz w:val="26"/>
-          <w:szCs w:val="26"/>
-        </w:rPr>
-        <w:t xml:space="preserve">6.3 Cifrado en reposo</w:t>
+        <w:t xml:space="preserve">Para volúmenes superiores a 200 GB se recomienda implementar respaldos incrementales o diferenciales para optimizar tiempo y ancho de banda.</w:t>
       </w:r>
     </w:p>
     <w:p>
@@ -4207,7 +4660,24 @@
           <w:sz w:val="22"/>
           <w:szCs w:val="22"/>
         </w:rPr>
-        <w:t xml:space="preserve">Cifrado del volumen de almacenamiento del servidor (LUKS en Linux o BitLocker en Windows), de acuerdo con la política de seguridad institucional.</w:t>
+        <w:t xml:space="preserve">Pruebas periódicas de restauración para verificar la integridad de los respaldos.</w:t>
+      </w:r>
+    </w:p>
+    <w:p>
+      <w:pPr>
+        <w:pStyle w:val="Heading2"/>
+        <w:spacing w:after="120" w:before="240"/>
+      </w:pPr>
+      <w:r>
+        <w:rPr>
+          <w:rFonts w:ascii="Arial" w:cs="Arial" w:eastAsia="Arial" w:hAnsi="Arial"/>
+          <w:b/>
+          <w:bCs/>
+          <w:color w:val="1F4E79"/>
+          <w:sz w:val="26"/>
+          <w:szCs w:val="26"/>
+        </w:rPr>
+        <w:t xml:space="preserve">6.3 Cifrado en reposo</w:t>
       </w:r>
     </w:p>
     <w:p>
@@ -4225,7 +4695,78 @@
           <w:sz w:val="22"/>
           <w:szCs w:val="22"/>
         </w:rPr>
+        <w:t xml:space="preserve">Cifrado del volumen de almacenamiento del servidor (LUKS en Linux o BitLocker en Windows), de acuerdo con la política de seguridad institucional.</w:t>
+      </w:r>
+    </w:p>
+    <w:p>
+      <w:pPr>
+        <w:pStyle w:val="ListParagraph"/>
+        <w:numPr>
+          <w:ilvl w:val="0"/>
+          <w:numId w:val="2"/>
+        </w:numPr>
+        <w:spacing w:after="40" w:before="40" w:line="280"/>
+      </w:pPr>
+      <w:r>
+        <w:rPr>
+          <w:rFonts w:ascii="Arial" w:cs="Arial" w:eastAsia="Arial" w:hAnsi="Arial"/>
+          <w:sz w:val="22"/>
+          <w:szCs w:val="22"/>
+        </w:rPr>
         <w:t xml:space="preserve">Cifrado de los respaldos remotos antes de su transmisión y almacenamiento.</w:t>
+      </w:r>
+    </w:p>
+    <w:p>
+      <w:pPr>
+        <w:pStyle w:val="Heading2"/>
+        <w:spacing w:after="120" w:before="240"/>
+      </w:pPr>
+      <w:r>
+        <w:rPr>
+          <w:rFonts w:ascii="Arial" w:cs="Arial" w:eastAsia="Arial" w:hAnsi="Arial"/>
+          <w:b/>
+          <w:bCs/>
+          <w:color w:val="1F4E79"/>
+          <w:sz w:val="26"/>
+          <w:szCs w:val="26"/>
+        </w:rPr>
+        <w:t xml:space="preserve">6.4 Consideraciones de escalabilidad</w:t>
+      </w:r>
+    </w:p>
+    <w:p>
+      <w:pPr>
+        <w:pStyle w:val="ListParagraph"/>
+        <w:numPr>
+          <w:ilvl w:val="0"/>
+          <w:numId w:val="2"/>
+        </w:numPr>
+        <w:spacing w:after="40" w:before="40" w:line="280"/>
+      </w:pPr>
+      <w:r>
+        <w:rPr>
+          <w:rFonts w:ascii="Arial" w:cs="Arial" w:eastAsia="Arial" w:hAnsi="Arial"/>
+          <w:sz w:val="22"/>
+          <w:szCs w:val="22"/>
+        </w:rPr>
+        <w:t xml:space="preserve">La base de datos SQLite es adecuada para el volumen proyectado de 8.000 beneficiarios. En caso de superar 50.000 registros activos o de requerir alta disponibilidad, se recomienda evaluar la migración a PostgreSQL.</w:t>
+      </w:r>
+    </w:p>
+    <w:p>
+      <w:pPr>
+        <w:pStyle w:val="ListParagraph"/>
+        <w:numPr>
+          <w:ilvl w:val="0"/>
+          <w:numId w:val="2"/>
+        </w:numPr>
+        <w:spacing w:after="40" w:before="40" w:line="280"/>
+      </w:pPr>
+      <w:r>
+        <w:rPr>
+          <w:rFonts w:ascii="Arial" w:cs="Arial" w:eastAsia="Arial" w:hAnsi="Arial"/>
+          <w:sz w:val="22"/>
+          <w:szCs w:val="22"/>
+        </w:rPr>
+        <w:t xml:space="preserve">El directorio uploads/ puede migrarse a un servicio de almacenamiento de objetos (S3, Azure Blob, MinIO) en caso de crecimiento sostenido o de requerir replicación geográfica.</w:t>
       </w:r>
     </w:p>
     <w:p>
@@ -5363,6 +5904,24 @@
           <w:sz w:val="22"/>
           <w:szCs w:val="22"/>
         </w:rPr>
+        <w:t xml:space="preserve">Dada la criticidad del almacenamiento, se recomienda configurar alertas tempranas cuando el uso del disco de datos supere el 70 % y el 85 %.</w:t>
+      </w:r>
+    </w:p>
+    <w:p>
+      <w:pPr>
+        <w:pStyle w:val="ListParagraph"/>
+        <w:numPr>
+          <w:ilvl w:val="0"/>
+          <w:numId w:val="2"/>
+        </w:numPr>
+        <w:spacing w:after="40" w:before="40" w:line="280"/>
+      </w:pPr>
+      <w:r>
+        <w:rPr>
+          <w:rFonts w:ascii="Arial" w:cs="Arial" w:eastAsia="Arial" w:hAnsi="Arial"/>
+          <w:sz w:val="22"/>
+          <w:szCs w:val="22"/>
+        </w:rPr>
         <w:t xml:space="preserve">Conservación de logs por al menos 90 días en línea y 12 meses en almacenamiento frío, conforme a la política institucional.</w:t>
       </w:r>
     </w:p>
@@ -5383,7 +5942,7 @@
           <w:sz w:val="32"/>
           <w:szCs w:val="32"/>
         </w:rPr>
-        <w:t xml:space="preserve">9. Opciones de Hosting</w:t>
+        <w:t xml:space="preserve">9. Modalidad de Hosting</w:t>
       </w:r>
     </w:p>
     <w:p>
@@ -5397,7 +5956,7 @@
           <w:sz w:val="22"/>
           <w:szCs w:val="22"/>
         </w:rPr>
-        <w:t xml:space="preserve">El aplicativo puede desplegarse en cualquiera de las siguientes modalidades, según las políticas y la disponibilidad de infraestructura institucional:</w:t>
+        <w:t xml:space="preserve">El despliegue del aplicativo se realizará sobre la infraestructura institucional de MINTIC, mediante el aprovisionamiento de una máquina virtual dedicada en el datacenter oficial.</w:t>
       </w:r>
     </w:p>
     <w:tbl>
@@ -5590,7 +6149,7 @@
                 <w:sz w:val="20"/>
                 <w:szCs w:val="20"/>
               </w:rPr>
-              <w:t xml:space="preserve">Máquina virtual en datacenter institucional con las especificaciones del numeral 3</w:t>
+              <w:t xml:space="preserve">Máquina virtual con 4 vCPU, 8 GB RAM y volumen de datos de 1 TB SSD</w:t>
             </w:r>
           </w:p>
         </w:tc>
@@ -5623,316 +6182,7 @@
                 <w:sz w:val="20"/>
                 <w:szCs w:val="20"/>
               </w:rPr>
-              <w:t xml:space="preserve">Opción preferida si existe disponibilidad</w:t>
-            </w:r>
-          </w:p>
-        </w:tc>
-      </w:tr>
-      <w:tr>
-        <w:tc>
-          <w:tcPr>
-            <w:tcW w:type="dxa" w:w="3000"/>
-            <w:tcBorders>
-              <w:top w:val="single" w:color="CCCCCC" w:sz="4"/>
-              <w:left w:val="single" w:color="CCCCCC" w:sz="4"/>
-              <w:bottom w:val="single" w:color="CCCCCC" w:sz="4"/>
-              <w:right w:val="single" w:color="CCCCCC" w:sz="4"/>
-            </w:tcBorders>
-            <w:shd w:fill="F2F7FB" w:val="clear"/>
-            <w:tcMar>
-              <w:top w:type="dxa" w:w="80"/>
-              <w:left w:type="dxa" w:w="140"/>
-              <w:bottom w:type="dxa" w:w="80"/>
-              <w:right w:type="dxa" w:w="140"/>
-            </w:tcMar>
-          </w:tcPr>
-          <w:p>
-            <w:pPr>
-              <w:spacing w:after="40" w:before="40"/>
-              <w:jc w:val="left"/>
-            </w:pPr>
-            <w:r>
-              <w:rPr>
-                <w:rFonts w:ascii="Arial" w:cs="Arial" w:eastAsia="Arial" w:hAnsi="Arial"/>
-                <w:b/>
-                <w:bCs/>
-                <w:sz w:val="20"/>
-                <w:szCs w:val="20"/>
-              </w:rPr>
-              <w:t xml:space="preserve">Nube institucional (IaaS)</w:t>
-            </w:r>
-          </w:p>
-        </w:tc>
-        <w:tc>
-          <w:tcPr>
-            <w:tcW w:type="dxa" w:w="4000"/>
-            <w:tcBorders>
-              <w:top w:val="single" w:color="CCCCCC" w:sz="4"/>
-              <w:left w:val="single" w:color="CCCCCC" w:sz="4"/>
-              <w:bottom w:val="single" w:color="CCCCCC" w:sz="4"/>
-              <w:right w:val="single" w:color="CCCCCC" w:sz="4"/>
-            </w:tcBorders>
-            <w:shd w:fill="F2F7FB" w:val="clear"/>
-            <w:tcMar>
-              <w:top w:type="dxa" w:w="80"/>
-              <w:left w:type="dxa" w:w="140"/>
-              <w:bottom w:type="dxa" w:w="80"/>
-              <w:right w:type="dxa" w:w="140"/>
-            </w:tcMar>
-          </w:tcPr>
-          <w:p>
-            <w:pPr>
-              <w:spacing w:after="40" w:before="40"/>
-              <w:jc w:val="left"/>
-            </w:pPr>
-            <w:r>
-              <w:rPr>
-                <w:rFonts w:ascii="Arial" w:cs="Arial" w:eastAsia="Arial" w:hAnsi="Arial"/>
-                <w:b w:val="false"/>
-                <w:bCs w:val="false"/>
-                <w:sz w:val="20"/>
-                <w:szCs w:val="20"/>
-              </w:rPr>
-              <w:t xml:space="preserve">Instancia equivalente en la nube oficial del Estado</w:t>
-            </w:r>
-          </w:p>
-        </w:tc>
-        <w:tc>
-          <w:tcPr>
-            <w:tcW w:type="dxa" w:w="2360"/>
-            <w:tcBorders>
-              <w:top w:val="single" w:color="CCCCCC" w:sz="4"/>
-              <w:left w:val="single" w:color="CCCCCC" w:sz="4"/>
-              <w:bottom w:val="single" w:color="CCCCCC" w:sz="4"/>
-              <w:right w:val="single" w:color="CCCCCC" w:sz="4"/>
-            </w:tcBorders>
-            <w:shd w:fill="F2F7FB" w:val="clear"/>
-            <w:tcMar>
-              <w:top w:type="dxa" w:w="80"/>
-              <w:left w:type="dxa" w:w="140"/>
-              <w:bottom w:type="dxa" w:w="80"/>
-              <w:right w:type="dxa" w:w="140"/>
-            </w:tcMar>
-          </w:tcPr>
-          <w:p>
-            <w:pPr>
-              <w:spacing w:after="40" w:before="40"/>
-              <w:jc w:val="left"/>
-            </w:pPr>
-            <w:r>
-              <w:rPr>
-                <w:rFonts w:ascii="Arial" w:cs="Arial" w:eastAsia="Arial" w:hAnsi="Arial"/>
-                <w:b w:val="false"/>
-                <w:bCs w:val="false"/>
-                <w:sz w:val="20"/>
-                <w:szCs w:val="20"/>
-              </w:rPr>
-              <w:t xml:space="preserve">Cumplimiento de soberanía de datos</w:t>
-            </w:r>
-          </w:p>
-        </w:tc>
-      </w:tr>
-      <w:tr>
-        <w:tc>
-          <w:tcPr>
-            <w:tcW w:type="dxa" w:w="3000"/>
-            <w:tcBorders>
-              <w:top w:val="single" w:color="CCCCCC" w:sz="4"/>
-              <w:left w:val="single" w:color="CCCCCC" w:sz="4"/>
-              <w:bottom w:val="single" w:color="CCCCCC" w:sz="4"/>
-              <w:right w:val="single" w:color="CCCCCC" w:sz="4"/>
-            </w:tcBorders>
-            <w:tcMar>
-              <w:top w:type="dxa" w:w="80"/>
-              <w:left w:type="dxa" w:w="140"/>
-              <w:bottom w:type="dxa" w:w="80"/>
-              <w:right w:type="dxa" w:w="140"/>
-            </w:tcMar>
-          </w:tcPr>
-          <w:p>
-            <w:pPr>
-              <w:spacing w:after="40" w:before="40"/>
-              <w:jc w:val="left"/>
-            </w:pPr>
-            <w:r>
-              <w:rPr>
-                <w:rFonts w:ascii="Arial" w:cs="Arial" w:eastAsia="Arial" w:hAnsi="Arial"/>
-                <w:b/>
-                <w:bCs/>
-                <w:sz w:val="20"/>
-                <w:szCs w:val="20"/>
-              </w:rPr>
-              <w:t xml:space="preserve">Nube pública (AWS / Azure / GCP)</w:t>
-            </w:r>
-          </w:p>
-        </w:tc>
-        <w:tc>
-          <w:tcPr>
-            <w:tcW w:type="dxa" w:w="4000"/>
-            <w:tcBorders>
-              <w:top w:val="single" w:color="CCCCCC" w:sz="4"/>
-              <w:left w:val="single" w:color="CCCCCC" w:sz="4"/>
-              <w:bottom w:val="single" w:color="CCCCCC" w:sz="4"/>
-              <w:right w:val="single" w:color="CCCCCC" w:sz="4"/>
-            </w:tcBorders>
-            <w:tcMar>
-              <w:top w:type="dxa" w:w="80"/>
-              <w:left w:type="dxa" w:w="140"/>
-              <w:bottom w:type="dxa" w:w="80"/>
-              <w:right w:type="dxa" w:w="140"/>
-            </w:tcMar>
-          </w:tcPr>
-          <w:p>
-            <w:pPr>
-              <w:spacing w:after="40" w:before="40"/>
-              <w:jc w:val="left"/>
-            </w:pPr>
-            <w:r>
-              <w:rPr>
-                <w:rFonts w:ascii="Arial" w:cs="Arial" w:eastAsia="Arial" w:hAnsi="Arial"/>
-                <w:b w:val="false"/>
-                <w:bCs w:val="false"/>
-                <w:sz w:val="20"/>
-                <w:szCs w:val="20"/>
-              </w:rPr>
-              <w:t xml:space="preserve">EC2 t3.medium / Azure B2 / e2-medium con disco SSD de 100 GB</w:t>
-            </w:r>
-          </w:p>
-        </w:tc>
-        <w:tc>
-          <w:tcPr>
-            <w:tcW w:type="dxa" w:w="2360"/>
-            <w:tcBorders>
-              <w:top w:val="single" w:color="CCCCCC" w:sz="4"/>
-              <w:left w:val="single" w:color="CCCCCC" w:sz="4"/>
-              <w:bottom w:val="single" w:color="CCCCCC" w:sz="4"/>
-              <w:right w:val="single" w:color="CCCCCC" w:sz="4"/>
-            </w:tcBorders>
-            <w:tcMar>
-              <w:top w:type="dxa" w:w="80"/>
-              <w:left w:type="dxa" w:w="140"/>
-              <w:bottom w:type="dxa" w:w="80"/>
-              <w:right w:type="dxa" w:w="140"/>
-            </w:tcMar>
-          </w:tcPr>
-          <w:p>
-            <w:pPr>
-              <w:spacing w:after="40" w:before="40"/>
-              <w:jc w:val="left"/>
-            </w:pPr>
-            <w:r>
-              <w:rPr>
-                <w:rFonts w:ascii="Arial" w:cs="Arial" w:eastAsia="Arial" w:hAnsi="Arial"/>
-                <w:b w:val="false"/>
-                <w:bCs w:val="false"/>
-                <w:sz w:val="20"/>
-                <w:szCs w:val="20"/>
-              </w:rPr>
-              <w:t xml:space="preserve">Sujeto a políticas de contratación</w:t>
-            </w:r>
-          </w:p>
-        </w:tc>
-      </w:tr>
-      <w:tr>
-        <w:tc>
-          <w:tcPr>
-            <w:tcW w:type="dxa" w:w="3000"/>
-            <w:tcBorders>
-              <w:top w:val="single" w:color="CCCCCC" w:sz="4"/>
-              <w:left w:val="single" w:color="CCCCCC" w:sz="4"/>
-              <w:bottom w:val="single" w:color="CCCCCC" w:sz="4"/>
-              <w:right w:val="single" w:color="CCCCCC" w:sz="4"/>
-            </w:tcBorders>
-            <w:shd w:fill="F2F7FB" w:val="clear"/>
-            <w:tcMar>
-              <w:top w:type="dxa" w:w="80"/>
-              <w:left w:type="dxa" w:w="140"/>
-              <w:bottom w:type="dxa" w:w="80"/>
-              <w:right w:type="dxa" w:w="140"/>
-            </w:tcMar>
-          </w:tcPr>
-          <w:p>
-            <w:pPr>
-              <w:spacing w:after="40" w:before="40"/>
-              <w:jc w:val="left"/>
-            </w:pPr>
-            <w:r>
-              <w:rPr>
-                <w:rFonts w:ascii="Arial" w:cs="Arial" w:eastAsia="Arial" w:hAnsi="Arial"/>
-                <w:b/>
-                <w:bCs/>
-                <w:sz w:val="20"/>
-                <w:szCs w:val="20"/>
-              </w:rPr>
-              <w:t xml:space="preserve">VPS gestionado</w:t>
-            </w:r>
-          </w:p>
-        </w:tc>
-        <w:tc>
-          <w:tcPr>
-            <w:tcW w:type="dxa" w:w="4000"/>
-            <w:tcBorders>
-              <w:top w:val="single" w:color="CCCCCC" w:sz="4"/>
-              <w:left w:val="single" w:color="CCCCCC" w:sz="4"/>
-              <w:bottom w:val="single" w:color="CCCCCC" w:sz="4"/>
-              <w:right w:val="single" w:color="CCCCCC" w:sz="4"/>
-            </w:tcBorders>
-            <w:shd w:fill="F2F7FB" w:val="clear"/>
-            <w:tcMar>
-              <w:top w:type="dxa" w:w="80"/>
-              <w:left w:type="dxa" w:w="140"/>
-              <w:bottom w:type="dxa" w:w="80"/>
-              <w:right w:type="dxa" w:w="140"/>
-            </w:tcMar>
-          </w:tcPr>
-          <w:p>
-            <w:pPr>
-              <w:spacing w:after="40" w:before="40"/>
-              <w:jc w:val="left"/>
-            </w:pPr>
-            <w:r>
-              <w:rPr>
-                <w:rFonts w:ascii="Arial" w:cs="Arial" w:eastAsia="Arial" w:hAnsi="Arial"/>
-                <w:b w:val="false"/>
-                <w:bCs w:val="false"/>
-                <w:sz w:val="20"/>
-                <w:szCs w:val="20"/>
-              </w:rPr>
-              <w:t xml:space="preserve">Instancia con 4 vCPU, 8 GB RAM y 80 GB SSD</w:t>
-            </w:r>
-          </w:p>
-        </w:tc>
-        <w:tc>
-          <w:tcPr>
-            <w:tcW w:type="dxa" w:w="2360"/>
-            <w:tcBorders>
-              <w:top w:val="single" w:color="CCCCCC" w:sz="4"/>
-              <w:left w:val="single" w:color="CCCCCC" w:sz="4"/>
-              <w:bottom w:val="single" w:color="CCCCCC" w:sz="4"/>
-              <w:right w:val="single" w:color="CCCCCC" w:sz="4"/>
-            </w:tcBorders>
-            <w:shd w:fill="F2F7FB" w:val="clear"/>
-            <w:tcMar>
-              <w:top w:type="dxa" w:w="80"/>
-              <w:left w:type="dxa" w:w="140"/>
-              <w:bottom w:type="dxa" w:w="80"/>
-              <w:right w:type="dxa" w:w="140"/>
-            </w:tcMar>
-          </w:tcPr>
-          <w:p>
-            <w:pPr>
-              <w:spacing w:after="40" w:before="40"/>
-              <w:jc w:val="left"/>
-            </w:pPr>
-            <w:r>
-              <w:rPr>
-                <w:rFonts w:ascii="Arial" w:cs="Arial" w:eastAsia="Arial" w:hAnsi="Arial"/>
-                <w:b w:val="false"/>
-                <w:bCs w:val="false"/>
-                <w:sz w:val="20"/>
-                <w:szCs w:val="20"/>
-              </w:rPr>
-              <w:t xml:space="preserve">Solo para ambientes de prueba o piloto</w:t>
+              <w:t xml:space="preserve">Opción definida para el despliegue</w:t>
             </w:r>
           </w:p>
         </w:tc>
@@ -5957,7 +6207,7 @@
           <w:sz w:val="22"/>
           <w:szCs w:val="22"/>
         </w:rPr>
-        <w:t xml:space="preserve">Independientemente de la modalidad seleccionada, el aplicativo conserva los mismos requisitos técnicos descritos en este documento.</w:t>
+        <w:t xml:space="preserve">Esta modalidad garantiza el cumplimiento de la soberanía de datos y el control institucional sobre los recursos, conforme a las políticas de seguridad de la información de MINTIC.</w:t>
       </w:r>
     </w:p>
     <w:p>
@@ -6027,7 +6277,7 @@
           <w:sz w:val="22"/>
           <w:szCs w:val="22"/>
         </w:rPr>
-        <w:t xml:space="preserve">Node.js LTS instalado junto con todas las dependencias del sistema operativo requeridas por Puppeteer.</w:t>
+        <w:t xml:space="preserve">Volumen de datos de al menos 800 GB SSD montado y disponible para la aplicación.</w:t>
       </w:r>
     </w:p>
     <w:p>
@@ -6045,7 +6295,7 @@
           <w:sz w:val="22"/>
           <w:szCs w:val="22"/>
         </w:rPr>
-        <w:t xml:space="preserve">Repositorio del aplicativo desplegado y dependencias instaladas mediante npm ci --omit=dev.</w:t>
+        <w:t xml:space="preserve">Node.js LTS instalado junto con todas las dependencias del sistema operativo requeridas por Puppeteer.</w:t>
       </w:r>
     </w:p>
     <w:p>
@@ -6063,7 +6313,7 @@
           <w:sz w:val="22"/>
           <w:szCs w:val="22"/>
         </w:rPr>
-        <w:t xml:space="preserve">Archivo .env configurado con NODE_ENV=production y JWT_SECRET seguro.</w:t>
+        <w:t xml:space="preserve">Repositorio del aplicativo desplegado y dependencias instaladas mediante npm ci --omit=dev.</w:t>
       </w:r>
     </w:p>
     <w:p>
@@ -6081,7 +6331,7 @@
           <w:sz w:val="22"/>
           <w:szCs w:val="22"/>
         </w:rPr>
-        <w:t xml:space="preserve">Base de datos inicializada y usuario administrador creado mediante el script de semilla.</w:t>
+        <w:t xml:space="preserve">Archivo .env configurado con NODE_ENV=production y JWT_SECRET seguro.</w:t>
       </w:r>
     </w:p>
     <w:p>
@@ -6099,7 +6349,7 @@
           <w:sz w:val="22"/>
           <w:szCs w:val="22"/>
         </w:rPr>
-        <w:t xml:space="preserve">PM2 o systemd configurado para auto-reinicio y arranque del servicio.</w:t>
+        <w:t xml:space="preserve">Base de datos inicializada y usuario administrador creado mediante el script de semilla.</w:t>
       </w:r>
     </w:p>
     <w:p>
@@ -6117,7 +6367,7 @@
           <w:sz w:val="22"/>
           <w:szCs w:val="22"/>
         </w:rPr>
-        <w:t xml:space="preserve">Nginx configurado como proxy inverso con TLS y redirección 80 → 443.</w:t>
+        <w:t xml:space="preserve">PM2 o systemd configurado para auto-reinicio y arranque del servicio.</w:t>
       </w:r>
     </w:p>
     <w:p>
@@ -6135,7 +6385,7 @@
           <w:sz w:val="22"/>
           <w:szCs w:val="22"/>
         </w:rPr>
-        <w:t xml:space="preserve">Firewall, fail2ban y políticas de actualización automática activos.</w:t>
+        <w:t xml:space="preserve">Nginx configurado como proxy inverso con TLS y redirección 80 → 443.</w:t>
       </w:r>
     </w:p>
     <w:p>
@@ -6153,7 +6403,7 @@
           <w:sz w:val="22"/>
           <w:szCs w:val="22"/>
         </w:rPr>
-        <w:t xml:space="preserve">Respaldos programados y validados mediante una prueba de restauración.</w:t>
+        <w:t xml:space="preserve">Firewall, fail2ban y políticas de actualización automática activos.</w:t>
       </w:r>
     </w:p>
     <w:p>
@@ -6171,7 +6421,7 @@
           <w:sz w:val="22"/>
           <w:szCs w:val="22"/>
         </w:rPr>
-        <w:t xml:space="preserve">Monitoreo, alertas y dashboards operativos.</w:t>
+        <w:t xml:space="preserve">Respaldos programados, validados mediante una prueba de restauración y con destino externo dimensionado a 1 TB.</w:t>
       </w:r>
     </w:p>
     <w:p>
@@ -6189,6 +6439,24 @@
           <w:sz w:val="22"/>
           <w:szCs w:val="22"/>
         </w:rPr>
+        <w:t xml:space="preserve">Monitoreo, alertas y dashboards operativos.</w:t>
+      </w:r>
+    </w:p>
+    <w:p>
+      <w:pPr>
+        <w:pStyle w:val="ListParagraph"/>
+        <w:numPr>
+          <w:ilvl w:val="0"/>
+          <w:numId w:val="2"/>
+        </w:numPr>
+        <w:spacing w:after="40" w:before="40" w:line="280"/>
+      </w:pPr>
+      <w:r>
+        <w:rPr>
+          <w:rFonts w:ascii="Arial" w:cs="Arial" w:eastAsia="Arial" w:hAnsi="Arial"/>
+          <w:sz w:val="22"/>
+          <w:szCs w:val="22"/>
+        </w:rPr>
         <w:t xml:space="preserve">DNS apuntando al servidor y pruebas funcionales completadas.</w:t>
       </w:r>
     </w:p>
@@ -6223,7 +6491,7 @@
           <w:sz w:val="22"/>
           <w:szCs w:val="22"/>
         </w:rPr>
-        <w:t xml:space="preserve">Los recursos técnicos descritos en este documento constituyen el conjunto mínimo y recomendado para el despliegue del aplicativo Cuestionario MINTIC en un ambiente productivo. La provisión adecuada de estos recursos garantiza la disponibilidad, integridad y confidencialidad de la información gestionada por el aplicativo.</w:t>
+        <w:t xml:space="preserve">Los recursos técnicos descritos en este documento constituyen el conjunto mínimo y recomendado para el despliegue del aplicativo Cuestionario MINTIC en un ambiente productivo, dimensionados para una base de 8.000 beneficiarios. La provisión adecuada de estos recursos garantiza la disponibilidad, integridad y confidencialidad de la información gestionada por el aplicativo.</w:t>
       </w:r>
     </w:p>
     <w:p>
@@ -6237,7 +6505,21 @@
           <w:sz w:val="22"/>
           <w:szCs w:val="22"/>
         </w:rPr>
-        <w:t xml:space="preserve">El dimensionamiento propuesto contempla un escenario de operación institucional típico. En caso de incrementos significativos en el volumen de usuarios, el número de envíos o la frecuencia de generación de documentos, se recomienda revisar las especificaciones de CPU, memoria y almacenamiento para mantener los niveles de servicio esperados.</w:t>
+        <w:t xml:space="preserve">El componente más crítico en el dimensionamiento es el almacenamiento, debido al volumen de archivos adjuntos asociado a la población objetivo. Por esta razón, se recomienda contar con un volumen dedicado de al menos 800 GB SSD para datos y archivos, junto con un almacenamiento externo de respaldo de capacidad equivalente.</w:t>
+      </w:r>
+    </w:p>
+    <w:p>
+      <w:pPr>
+        <w:spacing w:after="80" w:before="80" w:line="300"/>
+        <w:jc w:val="both"/>
+      </w:pPr>
+      <w:r>
+        <w:rPr>
+          <w:rFonts w:ascii="Arial" w:cs="Arial" w:eastAsia="Arial" w:hAnsi="Arial"/>
+          <w:sz w:val="22"/>
+          <w:szCs w:val="22"/>
+        </w:rPr>
+        <w:t xml:space="preserve">En caso de incrementos significativos en el volumen de beneficiarios, el número de envíos o la frecuencia de generación de documentos, se recomienda revisar las especificaciones de CPU, memoria y almacenamiento, así como evaluar la migración de la base de datos a PostgreSQL y de los archivos a un servicio de almacenamiento de objetos.</w:t>
       </w:r>
     </w:p>
     <w:p>

</xml_diff>

<commit_message>
docs: remover justificacion de 8000 beneficiarios manteniendo el almacenamiento ampliado
Co-Authored-By: Claude Opus 4.7 (1M context) <noreply@anthropic.com>
</commit_message>
<xml_diff>
--- a/docs/Recursos_Tecnicos_Despliegue_MINTIC.docx
+++ b/docs/Recursos_Tecnicos_Despliegue_MINTIC.docx
@@ -75,7 +75,7 @@
           <w:sz w:val="24"/>
           <w:szCs w:val="24"/>
         </w:rPr>
-        <w:t xml:space="preserve">Versión 1.1</w:t>
+        <w:t xml:space="preserve">Versión 1.2</w:t>
       </w:r>
     </w:p>
     <w:p>
@@ -254,136 +254,7 @@
           <w:sz w:val="22"/>
           <w:szCs w:val="22"/>
         </w:rPr>
-        <w:t xml:space="preserve">El informe contempla el despliegue de una única instancia productiva del aplicativo, con base de datos embebida (SQLite) y almacenamiento local de archivos. El dimensionamiento de los recursos se realiza considerando una base estimada de 8.000 beneficiarios, cada uno con la posibilidad de cargar hasta 5 archivos de hasta 10 MB. Se incluyen recomendaciones sobre escalabilidad y alta disponibilidad como referencia, sin que constituyan parte del despliegue mínimo viable.</w:t>
-      </w:r>
-    </w:p>
-    <w:p>
-      <w:pPr>
-        <w:pStyle w:val="Heading2"/>
-        <w:spacing w:after="120" w:before="240"/>
-      </w:pPr>
-      <w:r>
-        <w:rPr>
-          <w:rFonts w:ascii="Arial" w:cs="Arial" w:eastAsia="Arial" w:hAnsi="Arial"/>
-          <w:b/>
-          <w:bCs/>
-          <w:color w:val="1F4E79"/>
-          <w:sz w:val="26"/>
-          <w:szCs w:val="26"/>
-        </w:rPr>
-        <w:t xml:space="preserve">1.3 Premisas de dimensionamiento</w:t>
-      </w:r>
-    </w:p>
-    <w:p>
-      <w:pPr>
-        <w:pStyle w:val="ListParagraph"/>
-        <w:numPr>
-          <w:ilvl w:val="0"/>
-          <w:numId w:val="2"/>
-        </w:numPr>
-        <w:spacing w:after="40" w:before="40" w:line="280"/>
-      </w:pPr>
-      <w:r>
-        <w:rPr>
-          <w:rFonts w:ascii="Arial" w:cs="Arial" w:eastAsia="Arial" w:hAnsi="Arial"/>
-          <w:b/>
-          <w:bCs/>
-          <w:sz w:val="22"/>
-          <w:szCs w:val="22"/>
-        </w:rPr>
-        <w:t xml:space="preserve">Población objetivo: </w:t>
-      </w:r>
-      <w:r>
-        <w:rPr>
-          <w:rFonts w:ascii="Arial" w:cs="Arial" w:eastAsia="Arial" w:hAnsi="Arial"/>
-          <w:sz w:val="22"/>
-          <w:szCs w:val="22"/>
-        </w:rPr>
-        <w:t xml:space="preserve">aproximadamente 8.000 beneficiarios registrados.</w:t>
-      </w:r>
-    </w:p>
-    <w:p>
-      <w:pPr>
-        <w:pStyle w:val="ListParagraph"/>
-        <w:numPr>
-          <w:ilvl w:val="0"/>
-          <w:numId w:val="2"/>
-        </w:numPr>
-        <w:spacing w:after="40" w:before="40" w:line="280"/>
-      </w:pPr>
-      <w:r>
-        <w:rPr>
-          <w:rFonts w:ascii="Arial" w:cs="Arial" w:eastAsia="Arial" w:hAnsi="Arial"/>
-          <w:b/>
-          <w:bCs/>
-          <w:sz w:val="22"/>
-          <w:szCs w:val="22"/>
-        </w:rPr>
-        <w:t xml:space="preserve">Carga de archivos: </w:t>
-      </w:r>
-      <w:r>
-        <w:rPr>
-          <w:rFonts w:ascii="Arial" w:cs="Arial" w:eastAsia="Arial" w:hAnsi="Arial"/>
-          <w:sz w:val="22"/>
-          <w:szCs w:val="22"/>
-        </w:rPr>
-        <w:t xml:space="preserve">hasta 5 archivos por envío, con un tamaño máximo de 10 MB cada uno (50 MB por beneficiario en el peor caso).</w:t>
-      </w:r>
-    </w:p>
-    <w:p>
-      <w:pPr>
-        <w:pStyle w:val="ListParagraph"/>
-        <w:numPr>
-          <w:ilvl w:val="0"/>
-          <w:numId w:val="2"/>
-        </w:numPr>
-        <w:spacing w:after="40" w:before="40" w:line="280"/>
-      </w:pPr>
-      <w:r>
-        <w:rPr>
-          <w:rFonts w:ascii="Arial" w:cs="Arial" w:eastAsia="Arial" w:hAnsi="Arial"/>
-          <w:b/>
-          <w:bCs/>
-          <w:sz w:val="22"/>
-          <w:szCs w:val="22"/>
-        </w:rPr>
-        <w:t xml:space="preserve">Concurrencia estimada: </w:t>
-      </w:r>
-      <w:r>
-        <w:rPr>
-          <w:rFonts w:ascii="Arial" w:cs="Arial" w:eastAsia="Arial" w:hAnsi="Arial"/>
-          <w:sz w:val="22"/>
-          <w:szCs w:val="22"/>
-        </w:rPr>
-        <w:t xml:space="preserve">hasta 200 usuarios simultáneos en horas pico.</w:t>
-      </w:r>
-    </w:p>
-    <w:p>
-      <w:pPr>
-        <w:pStyle w:val="ListParagraph"/>
-        <w:numPr>
-          <w:ilvl w:val="0"/>
-          <w:numId w:val="2"/>
-        </w:numPr>
-        <w:spacing w:after="40" w:before="40" w:line="280"/>
-      </w:pPr>
-      <w:r>
-        <w:rPr>
-          <w:rFonts w:ascii="Arial" w:cs="Arial" w:eastAsia="Arial" w:hAnsi="Arial"/>
-          <w:b/>
-          <w:bCs/>
-          <w:sz w:val="22"/>
-          <w:szCs w:val="22"/>
-        </w:rPr>
-        <w:t xml:space="preserve">Horizonte de planeación: </w:t>
-      </w:r>
-      <w:r>
-        <w:rPr>
-          <w:rFonts w:ascii="Arial" w:cs="Arial" w:eastAsia="Arial" w:hAnsi="Arial"/>
-          <w:sz w:val="22"/>
-          <w:szCs w:val="22"/>
-        </w:rPr>
-        <w:t xml:space="preserve">12 a 24 meses, con margen de crecimiento del 25 %.</w:t>
+        <w:t xml:space="preserve">El informe contempla el despliegue de una única instancia productiva del aplicativo, con base de datos embebida (SQLite) y almacenamiento local de archivos. Se incluyen recomendaciones sobre escalabilidad y alta disponibilidad como referencia, sin que constituyan parte del despliegue mínimo viable.</w:t>
       </w:r>
     </w:p>
     <w:p>
@@ -1255,7 +1126,7 @@
           <w:sz w:val="22"/>
           <w:szCs w:val="22"/>
         </w:rPr>
-        <w:t xml:space="preserve">El aplicativo puede ejecutarse sobre una única máquina virtual o servidor dedicado. El dimensionamiento se ha calculado considerando una base de 8.000 beneficiarios, con hasta 200 usuarios concurrentes y picos de generación de documentos.</w:t>
+        <w:t xml:space="preserve">El aplicativo puede ejecutarse sobre una única máquina virtual o servidor dedicado. El dimensionamiento se ha calculado para soportar hasta 200 usuarios concurrentes y picos de generación de documentos.</w:t>
       </w:r>
     </w:p>
     <w:p>
@@ -2076,7 +1947,7 @@
           <w:sz w:val="22"/>
           <w:szCs w:val="22"/>
         </w:rPr>
-        <w:t xml:space="preserve">El almacenamiento se dimensiona para una base de 8.000 beneficiarios con un promedio de 30 a 50 MB de archivos adjuntos por beneficiario, más espacio para la base de datos, los logs, los respaldos y un margen de crecimiento del 25 %.</w:t>
+        <w:t xml:space="preserve">El almacenamiento contempla la base de datos SQLite, los archivos cargados por los operadores (hasta 10 MB cada uno, hasta 5 archivos por envío), un margen de crecimiento del 25 % y los respaldos rotativos.</w:t>
       </w:r>
     </w:p>
     <w:p>
@@ -3785,7 +3656,7 @@
           <w:sz w:val="22"/>
           <w:szCs w:val="22"/>
         </w:rPr>
-        <w:t xml:space="preserve">El dimensionamiento de almacenamiento se realiza para una base de 8.000 beneficiarios. Considerando que cada beneficiario puede cargar hasta 5 archivos de 10 MB (50 MB en el peor caso) y un promedio realista de 30 a 50 MB por beneficiario, el volumen total de archivos puede alcanzar entre 240 GB y 400 GB, sin contar respaldos ni margen de crecimiento.</w:t>
+        <w:t xml:space="preserve">El almacenamiento es el componente más crítico del despliegue debido al volumen de archivos adjuntos que la aplicación debe gestionar. Cada envío admite hasta 5 archivos de hasta 10 MB, lo que implica un consumo significativo de espacio en producción y exige un volumen dedicado de capacidad amplia, separado del volumen del sistema operativo.</w:t>
       </w:r>
     </w:p>
     <w:p>
@@ -4028,7 +3899,7 @@
                 <w:sz w:val="20"/>
                 <w:szCs w:val="20"/>
               </w:rPr>
-              <w:t xml:space="preserve">500 MB a 2 GB (con 8.000 beneficiarios y sus respuestas)</w:t>
+              <w:t xml:space="preserve">500 MB a 2 GB</w:t>
             </w:r>
           </w:p>
         </w:tc>
@@ -4132,7 +4003,7 @@
                 <w:sz w:val="20"/>
                 <w:szCs w:val="20"/>
               </w:rPr>
-              <w:t xml:space="preserve">240 a 400 GB (8.000 × 30 a 50 MB promedio)</w:t>
+              <w:t xml:space="preserve">240 a 400 GB</w:t>
             </w:r>
           </w:p>
         </w:tc>
@@ -4748,7 +4619,7 @@
           <w:sz w:val="22"/>
           <w:szCs w:val="22"/>
         </w:rPr>
-        <w:t xml:space="preserve">La base de datos SQLite es adecuada para el volumen proyectado de 8.000 beneficiarios. En caso de superar 50.000 registros activos o de requerir alta disponibilidad, se recomienda evaluar la migración a PostgreSQL.</w:t>
+        <w:t xml:space="preserve">La base de datos SQLite es adecuada para el volumen previsto. En caso de superar 50.000 registros activos o de requerir alta disponibilidad, se recomienda evaluar la migración a PostgreSQL.</w:t>
       </w:r>
     </w:p>
     <w:p>
@@ -6491,7 +6362,7 @@
           <w:sz w:val="22"/>
           <w:szCs w:val="22"/>
         </w:rPr>
-        <w:t xml:space="preserve">Los recursos técnicos descritos en este documento constituyen el conjunto mínimo y recomendado para el despliegue del aplicativo Cuestionario MINTIC en un ambiente productivo, dimensionados para una base de 8.000 beneficiarios. La provisión adecuada de estos recursos garantiza la disponibilidad, integridad y confidencialidad de la información gestionada por el aplicativo.</w:t>
+        <w:t xml:space="preserve">Los recursos técnicos descritos en este documento constituyen el conjunto mínimo y recomendado para el despliegue del aplicativo Cuestionario MINTIC en un ambiente productivo. La provisión adecuada de estos recursos garantiza la disponibilidad, integridad y confidencialidad de la información gestionada por el aplicativo.</w:t>
       </w:r>
     </w:p>
     <w:p>
@@ -6505,7 +6376,7 @@
           <w:sz w:val="22"/>
           <w:szCs w:val="22"/>
         </w:rPr>
-        <w:t xml:space="preserve">El componente más crítico en el dimensionamiento es el almacenamiento, debido al volumen de archivos adjuntos asociado a la población objetivo. Por esta razón, se recomienda contar con un volumen dedicado de al menos 800 GB SSD para datos y archivos, junto con un almacenamiento externo de respaldo de capacidad equivalente.</w:t>
+        <w:t xml:space="preserve">El componente más crítico en el dimensionamiento es el almacenamiento, debido al volumen de archivos adjuntos que la aplicación debe gestionar. Por esta razón, se recomienda contar con un volumen dedicado de al menos 800 GB SSD para datos y archivos, junto con un almacenamiento externo de respaldo de capacidad equivalente.</w:t>
       </w:r>
     </w:p>
     <w:p>
@@ -6519,7 +6390,7 @@
           <w:sz w:val="22"/>
           <w:szCs w:val="22"/>
         </w:rPr>
-        <w:t xml:space="preserve">En caso de incrementos significativos en el volumen de beneficiarios, el número de envíos o la frecuencia de generación de documentos, se recomienda revisar las especificaciones de CPU, memoria y almacenamiento, así como evaluar la migración de la base de datos a PostgreSQL y de los archivos a un servicio de almacenamiento de objetos.</w:t>
+        <w:t xml:space="preserve">En caso de incrementos significativos en el volumen de envíos o la frecuencia de generación de documentos, se recomienda revisar las especificaciones de CPU, memoria y almacenamiento, así como evaluar la migración de la base de datos a PostgreSQL y de los archivos a un servicio de almacenamiento de objetos.</w:t>
       </w:r>
     </w:p>
     <w:p>

</xml_diff>